<commit_message>
A4 submission doc size error
</commit_message>
<xml_diff>
--- a/publisher-submissions/ignatius/final-submission/sacrae-preces-volume-1-submission-a4-next-page.docx
+++ b/publisher-submissions/ignatius/final-submission/sacrae-preces-volume-1-submission-a4-next-page.docx
@@ -136,8 +136,10 @@
         </w:rPr>
         <w:sectPr>
           <w:footerReference w:type="default" r:id="rId8"/>
+          <w:footerReference w:type="first" r:id="rId9"/>
           <w:pgSz w:w="11909" w:h="16834" w:code="9"/>
           <w:pgMar w:top="1440" w:right="1440" w:bottom="1440" w:left="1440" w:header="576" w:footer="576" w:gutter="0"/>
+          <w:pgNumType w:start="1"/>
           <w:cols w:space="720"/>
           <w:titlePg/>
           <w:docGrid w:linePitch="360"/>
@@ -9138,10 +9140,9 @@
           <w:szCs w:val="24"/>
         </w:rPr>
         <w:sectPr>
-          <w:footerReference w:type="first" r:id="rId9"/>
+          <w:footerReference w:type="first" r:id="rId10"/>
           <w:pgSz w:w="11909" w:h="16834" w:code="9"/>
           <w:pgMar w:top="1440" w:right="1440" w:bottom="1440" w:left="1440" w:header="576" w:footer="576" w:gutter="0"/>
-          <w:pgNumType w:fmt="lowerRoman"/>
           <w:cols w:space="720"/>
           <w:titlePg/>
           <w:docGrid w:linePitch="360"/>
@@ -10282,7 +10283,7 @@
           <w:szCs w:val="24"/>
         </w:rPr>
         <w:sectPr>
-          <w:footerReference w:type="first" r:id="rId10"/>
+          <w:footerReference w:type="first" r:id="rId11"/>
           <w:pgSz w:w="11909" w:h="16834" w:code="9"/>
           <w:pgMar w:top="1440" w:right="1440" w:bottom="1440" w:left="1440" w:header="576" w:footer="576" w:gutter="0"/>
           <w:cols w:space="720"/>
@@ -44314,6 +44315,59 @@
 <w:ftr xmlns:wpc="http://schemas.microsoft.com/office/word/2010/wordprocessingCanvas" xmlns:cx="http://schemas.microsoft.com/office/drawing/2014/chartex" xmlns:cx1="http://schemas.microsoft.com/office/drawing/2015/9/8/chartex" xmlns:cx2="http://schemas.microsoft.com/office/drawing/2015/10/21/chartex" xmlns:cx3="http://schemas.microsoft.com/office/drawing/2016/5/9/chartex" xmlns:cx4="http://schemas.microsoft.com/office/drawing/2016/5/10/chartex" xmlns:cx5="http://schemas.microsoft.com/office/drawing/2016/5/11/chartex" xmlns:cx6="http://schemas.microsoft.com/office/drawing/2016/5/12/chartex" xmlns:cx7="http://schemas.microsoft.com/office/drawing/2016/5/13/chartex" xmlns:cx8="http://schemas.microsoft.com/office/drawing/2016/5/14/chartex" xmlns:mc="http://schemas.openxmlformats.org/markup-compatibility/2006" xmlns:aink="http://schemas.microsoft.com/office/drawing/2016/ink" xmlns:am3d="http://schemas.microsoft.com/office/drawing/2017/model3d" xmlns:o="urn:schemas-microsoft-com:office:office" xmlns:oel="http://schemas.microsoft.com/office/2019/extlst" xmlns:r="http://schemas.openxmlformats.org/officeDocument/2006/relationships" xmlns:m="http://schemas.openxmlformats.org/officeDocument/2006/math" xmlns:v="urn:schemas-microsoft-com:vml" xmlns:wp14="http://schemas.microsoft.com/office/word/2010/wordprocessingDrawing" xmlns:wp="http://schemas.openxmlformats.org/drawingml/2006/wordprocessingDrawing" xmlns:w10="urn:schemas-microsoft-com:office:word" xmlns:w="http://schemas.openxmlformats.org/wordprocessingml/2006/main" xmlns:w14="http://schemas.microsoft.com/office/word/2010/wordml" xmlns:w15="http://schemas.microsoft.com/office/word/2012/wordml" xmlns:w16cex="http://schemas.microsoft.com/office/word/2018/wordml/cex" xmlns:w16cid="http://schemas.microsoft.com/office/word/2016/wordml/cid" xmlns:w16="http://schemas.microsoft.com/office/word/2018/wordml" xmlns:w16du="http://schemas.microsoft.com/office/word/2023/wordml/word16du" xmlns:w16sdtdh="http://schemas.microsoft.com/office/word/2020/wordml/sdtdatahash" xmlns:w16sdtfl="http://schemas.microsoft.com/office/word/2024/wordml/sdtformatlock" xmlns:w16se="http://schemas.microsoft.com/office/word/2015/wordml/symex" xmlns:wpg="http://schemas.microsoft.com/office/word/2010/wordprocessingGroup" xmlns:wpi="http://schemas.microsoft.com/office/word/2010/wordprocessingInk" xmlns:wne="http://schemas.microsoft.com/office/word/2006/wordml" xmlns:wps="http://schemas.microsoft.com/office/word/2010/wordprocessingShape" mc:Ignorable="w14 w15 w16se w16cid w16 w16cex w16sdtdh w16sdtfl w16du wp14">
   <w:sdt>
     <w:sdtPr>
+      <w:id w:val="667597971"/>
+      <w:docPartObj>
+        <w:docPartGallery w:val="Page Numbers (Bottom of Page)"/>
+        <w:docPartUnique/>
+      </w:docPartObj>
+    </w:sdtPr>
+    <w:sdtEndPr>
+      <w:rPr>
+        <w:noProof/>
+      </w:rPr>
+    </w:sdtEndPr>
+    <w:sdtContent>
+      <w:p>
+        <w:pPr>
+          <w:pStyle w:val="Footer"/>
+          <w:jc w:val="center"/>
+        </w:pPr>
+        <w:r>
+          <w:fldChar w:fldCharType="begin"/>
+        </w:r>
+        <w:r>
+          <w:instrText xml:space="preserve"> PAGE   \* MERGEFORMAT </w:instrText>
+        </w:r>
+        <w:r>
+          <w:fldChar w:fldCharType="separate"/>
+        </w:r>
+        <w:r>
+          <w:rPr>
+            <w:noProof/>
+          </w:rPr>
+          <w:t>2</w:t>
+        </w:r>
+        <w:r>
+          <w:rPr>
+            <w:noProof/>
+          </w:rPr>
+          <w:fldChar w:fldCharType="end"/>
+        </w:r>
+      </w:p>
+    </w:sdtContent>
+  </w:sdt>
+  <w:p>
+    <w:pPr>
+      <w:pStyle w:val="Footer"/>
+    </w:pPr>
+  </w:p>
+</w:ftr>
+</file>
+
+<file path=word/footer3.xml><?xml version="1.0" encoding="utf-8"?>
+<w:ftr xmlns:wpc="http://schemas.microsoft.com/office/word/2010/wordprocessingCanvas" xmlns:cx="http://schemas.microsoft.com/office/drawing/2014/chartex" xmlns:cx1="http://schemas.microsoft.com/office/drawing/2015/9/8/chartex" xmlns:cx2="http://schemas.microsoft.com/office/drawing/2015/10/21/chartex" xmlns:cx3="http://schemas.microsoft.com/office/drawing/2016/5/9/chartex" xmlns:cx4="http://schemas.microsoft.com/office/drawing/2016/5/10/chartex" xmlns:cx5="http://schemas.microsoft.com/office/drawing/2016/5/11/chartex" xmlns:cx6="http://schemas.microsoft.com/office/drawing/2016/5/12/chartex" xmlns:cx7="http://schemas.microsoft.com/office/drawing/2016/5/13/chartex" xmlns:cx8="http://schemas.microsoft.com/office/drawing/2016/5/14/chartex" xmlns:mc="http://schemas.openxmlformats.org/markup-compatibility/2006" xmlns:aink="http://schemas.microsoft.com/office/drawing/2016/ink" xmlns:am3d="http://schemas.microsoft.com/office/drawing/2017/model3d" xmlns:o="urn:schemas-microsoft-com:office:office" xmlns:oel="http://schemas.microsoft.com/office/2019/extlst" xmlns:r="http://schemas.openxmlformats.org/officeDocument/2006/relationships" xmlns:m="http://schemas.openxmlformats.org/officeDocument/2006/math" xmlns:v="urn:schemas-microsoft-com:vml" xmlns:wp14="http://schemas.microsoft.com/office/word/2010/wordprocessingDrawing" xmlns:wp="http://schemas.openxmlformats.org/drawingml/2006/wordprocessingDrawing" xmlns:w10="urn:schemas-microsoft-com:office:word" xmlns:w="http://schemas.openxmlformats.org/wordprocessingml/2006/main" xmlns:w14="http://schemas.microsoft.com/office/word/2010/wordml" xmlns:w15="http://schemas.microsoft.com/office/word/2012/wordml" xmlns:w16cex="http://schemas.microsoft.com/office/word/2018/wordml/cex" xmlns:w16cid="http://schemas.microsoft.com/office/word/2016/wordml/cid" xmlns:w16="http://schemas.microsoft.com/office/word/2018/wordml" xmlns:w16du="http://schemas.microsoft.com/office/word/2023/wordml/word16du" xmlns:w16sdtdh="http://schemas.microsoft.com/office/word/2020/wordml/sdtdatahash" xmlns:w16sdtfl="http://schemas.microsoft.com/office/word/2024/wordml/sdtformatlock" xmlns:w16se="http://schemas.microsoft.com/office/word/2015/wordml/symex" xmlns:wpg="http://schemas.microsoft.com/office/word/2010/wordprocessingGroup" xmlns:wpi="http://schemas.microsoft.com/office/word/2010/wordprocessingInk" xmlns:wne="http://schemas.microsoft.com/office/word/2006/wordml" xmlns:wps="http://schemas.microsoft.com/office/word/2010/wordprocessingShape" mc:Ignorable="w14 w15 w16se w16cid w16 w16cex w16sdtdh w16sdtfl w16du wp14">
+  <w:sdt>
+    <w:sdtPr>
       <w:id w:val="1814912961"/>
       <w:docPartObj>
         <w:docPartGallery w:val="Page Numbers (Bottom of Page)"/>
@@ -44363,7 +44417,7 @@
 </w:ftr>
 </file>
 
-<file path=word/footer3.xml><?xml version="1.0" encoding="utf-8"?>
+<file path=word/footer4.xml><?xml version="1.0" encoding="utf-8"?>
 <w:ftr xmlns:wpc="http://schemas.microsoft.com/office/word/2010/wordprocessingCanvas" xmlns:cx="http://schemas.microsoft.com/office/drawing/2014/chartex" xmlns:cx1="http://schemas.microsoft.com/office/drawing/2015/9/8/chartex" xmlns:cx2="http://schemas.microsoft.com/office/drawing/2015/10/21/chartex" xmlns:cx3="http://schemas.microsoft.com/office/drawing/2016/5/9/chartex" xmlns:cx4="http://schemas.microsoft.com/office/drawing/2016/5/10/chartex" xmlns:cx5="http://schemas.microsoft.com/office/drawing/2016/5/11/chartex" xmlns:cx6="http://schemas.microsoft.com/office/drawing/2016/5/12/chartex" xmlns:cx7="http://schemas.microsoft.com/office/drawing/2016/5/13/chartex" xmlns:cx8="http://schemas.microsoft.com/office/drawing/2016/5/14/chartex" xmlns:mc="http://schemas.openxmlformats.org/markup-compatibility/2006" xmlns:aink="http://schemas.microsoft.com/office/drawing/2016/ink" xmlns:am3d="http://schemas.microsoft.com/office/drawing/2017/model3d" xmlns:o="urn:schemas-microsoft-com:office:office" xmlns:oel="http://schemas.microsoft.com/office/2019/extlst" xmlns:r="http://schemas.openxmlformats.org/officeDocument/2006/relationships" xmlns:m="http://schemas.openxmlformats.org/officeDocument/2006/math" xmlns:v="urn:schemas-microsoft-com:vml" xmlns:wp14="http://schemas.microsoft.com/office/word/2010/wordprocessingDrawing" xmlns:wp="http://schemas.openxmlformats.org/drawingml/2006/wordprocessingDrawing" xmlns:w10="urn:schemas-microsoft-com:office:word" xmlns:w="http://schemas.openxmlformats.org/wordprocessingml/2006/main" xmlns:w14="http://schemas.microsoft.com/office/word/2010/wordml" xmlns:w15="http://schemas.microsoft.com/office/word/2012/wordml" xmlns:w16cex="http://schemas.microsoft.com/office/word/2018/wordml/cex" xmlns:w16cid="http://schemas.microsoft.com/office/word/2016/wordml/cid" xmlns:w16="http://schemas.microsoft.com/office/word/2018/wordml" xmlns:w16du="http://schemas.microsoft.com/office/word/2023/wordml/word16du" xmlns:w16sdtdh="http://schemas.microsoft.com/office/word/2020/wordml/sdtdatahash" xmlns:w16sdtfl="http://schemas.microsoft.com/office/word/2024/wordml/sdtformatlock" xmlns:w16se="http://schemas.microsoft.com/office/word/2015/wordml/symex" xmlns:wpg="http://schemas.microsoft.com/office/word/2010/wordprocessingGroup" xmlns:wpi="http://schemas.microsoft.com/office/word/2010/wordprocessingInk" xmlns:wne="http://schemas.microsoft.com/office/word/2006/wordml" xmlns:wps="http://schemas.microsoft.com/office/word/2010/wordprocessingShape" mc:Ignorable="w14 w15 w16se w16cid w16 w16cex w16sdtdh w16sdtfl w16du wp14">
   <w:sdt>
     <w:sdtPr>

</xml_diff>